<commit_message>
Complete Phase 5: Add federated learning, restructure HTML files for proper structure and simplicity, and enhance navigation. Final SOC project with advanced features.
</commit_message>
<xml_diff>
--- a/Reports/Phase_4 Report.docx
+++ b/Reports/Phase_4 Report.docx
@@ -255,6 +255,249 @@
       </w:r>
       <w:r>
         <w:t>: Transforms the project from reactive detection to proactive, adaptive intelligence, positioning it as a cutting-edge SOC tool with long-term value in cybersecurity. Potential for industry adoption, but monitor for ethical decision-making.</w:t>
+      </w:r>
+    </w:p>
+    <w:p>
+      <w:r>
+        <w:t>The new RL integration adds adaptive, context-aware learning to the SOC system, making decision thresholds (containment/monitoring) evolve based on outcomes. Here's how it works:</w:t>
+      </w:r>
+    </w:p>
+    <w:p>
+      <w:pPr>
+        <w:rPr>
+          <w:b/>
+          <w:bCs/>
+        </w:rPr>
+      </w:pPr>
+      <w:r>
+        <w:rPr>
+          <w:b/>
+          <w:bCs/>
+        </w:rPr>
+        <w:t>Key Components</w:t>
+      </w:r>
+    </w:p>
+    <w:p>
+      <w:pPr>
+        <w:numPr>
+          <w:ilvl w:val="0"/>
+          <w:numId w:val="3"/>
+        </w:numPr>
+      </w:pPr>
+      <w:r>
+        <w:rPr>
+          <w:b/>
+          <w:bCs/>
+        </w:rPr>
+        <w:t>Adaptive Policy (</w:t>
+      </w:r>
+    </w:p>
+    <w:p>
+      <w:r>
+        <w:t>reinforcement_learning_agent.py</w:t>
+      </w:r>
+      <w:r>
+        <w:rPr>
+          <w:b/>
+          <w:bCs/>
+        </w:rPr>
+        <w:t>)</w:t>
+      </w:r>
+      <w:r>
+        <w:t>: Holds thresholds per context (e.g., {"ICU_5": {"</w:t>
+      </w:r>
+      <w:proofErr w:type="spellStart"/>
+      <w:r>
+        <w:t>containment_threshold</w:t>
+      </w:r>
+      <w:proofErr w:type="spellEnd"/>
+      <w:r>
+        <w:t>": 0.75}, "default": {...}}). Updates thresholds based on average rewards from recent decisions.</w:t>
+      </w:r>
+    </w:p>
+    <w:p>
+      <w:pPr>
+        <w:numPr>
+          <w:ilvl w:val="0"/>
+          <w:numId w:val="3"/>
+        </w:numPr>
+      </w:pPr>
+      <w:r>
+        <w:rPr>
+          <w:b/>
+          <w:bCs/>
+        </w:rPr>
+        <w:t>Outcome Feedback (</w:t>
+      </w:r>
+    </w:p>
+    <w:p>
+      <w:r>
+        <w:t>outcome_feedback_agent.py</w:t>
+      </w:r>
+      <w:r>
+        <w:rPr>
+          <w:b/>
+          <w:bCs/>
+        </w:rPr>
+        <w:t>)</w:t>
+      </w:r>
+      <w:r>
+        <w:t>: Simulates if a threat was real (</w:t>
+      </w:r>
+      <w:proofErr w:type="spellStart"/>
+      <w:r>
+        <w:t>fused_risk</w:t>
+      </w:r>
+      <w:proofErr w:type="spellEnd"/>
+      <w:r>
+        <w:t xml:space="preserve"> &gt;= 0.6), assigns rewards (+1.0 correct containment, -0.5 false, etc.), and stores (reward, </w:t>
+      </w:r>
+      <w:proofErr w:type="spellStart"/>
+      <w:r>
+        <w:t>context_key</w:t>
+      </w:r>
+      <w:proofErr w:type="spellEnd"/>
+      <w:r>
+        <w:t>) in </w:t>
+      </w:r>
+      <w:proofErr w:type="spellStart"/>
+      <w:r>
+        <w:t>learning_memory</w:t>
+      </w:r>
+      <w:proofErr w:type="spellEnd"/>
+      <w:r>
+        <w:t>.</w:t>
+      </w:r>
+    </w:p>
+    <w:p>
+      <w:pPr>
+        <w:numPr>
+          <w:ilvl w:val="0"/>
+          <w:numId w:val="3"/>
+        </w:numPr>
+      </w:pPr>
+      <w:r>
+        <w:rPr>
+          <w:b/>
+          <w:bCs/>
+        </w:rPr>
+        <w:t>Context Selection (</w:t>
+      </w:r>
+    </w:p>
+    <w:p>
+      <w:r>
+        <w:t>authority_agent.py</w:t>
+      </w:r>
+      <w:r>
+        <w:rPr>
+          <w:b/>
+          <w:bCs/>
+        </w:rPr>
+        <w:t>)</w:t>
+      </w:r>
+      <w:r>
+        <w:t xml:space="preserve">: Creates </w:t>
+      </w:r>
+      <w:proofErr w:type="spellStart"/>
+      <w:r>
+        <w:t>context_key</w:t>
+      </w:r>
+      <w:proofErr w:type="spellEnd"/>
+      <w:r>
+        <w:t xml:space="preserve"> (department + criticality), selects policy from </w:t>
+      </w:r>
+      <w:proofErr w:type="spellStart"/>
+      <w:r>
+        <w:t>adaptive_policy</w:t>
+      </w:r>
+      <w:proofErr w:type="spellEnd"/>
+      <w:r>
+        <w:t xml:space="preserve"> (fallback to default), and uses those thresholds for decisions.</w:t>
+      </w:r>
+    </w:p>
+    <w:p>
+      <w:pPr>
+        <w:rPr>
+          <w:b/>
+          <w:bCs/>
+        </w:rPr>
+      </w:pPr>
+      <w:r>
+        <w:rPr>
+          <w:b/>
+          <w:bCs/>
+        </w:rPr>
+        <w:t>How It Integrates</w:t>
+      </w:r>
+    </w:p>
+    <w:p>
+      <w:pPr>
+        <w:numPr>
+          <w:ilvl w:val="0"/>
+          <w:numId w:val="4"/>
+        </w:numPr>
+      </w:pPr>
+      <w:r>
+        <w:rPr>
+          <w:b/>
+          <w:bCs/>
+        </w:rPr>
+        <w:t>Flow</w:t>
+      </w:r>
+      <w:r>
+        <w:t>: After each /</w:t>
+      </w:r>
+      <w:proofErr w:type="spellStart"/>
+      <w:r>
+        <w:t>analyze</w:t>
+      </w:r>
+      <w:proofErr w:type="spellEnd"/>
+      <w:r>
+        <w:t>, authority makes decision → execution → audit → outcome assigns reward with context → RL groups by context and updates thresholds → next decision uses new thresholds.</w:t>
+      </w:r>
+    </w:p>
+    <w:p>
+      <w:pPr>
+        <w:numPr>
+          <w:ilvl w:val="0"/>
+          <w:numId w:val="4"/>
+        </w:numPr>
+      </w:pPr>
+      <w:r>
+        <w:rPr>
+          <w:b/>
+          <w:bCs/>
+        </w:rPr>
+        <w:t>Learning Loop</w:t>
+      </w:r>
+      <w:r>
+        <w:t xml:space="preserve">: Rewards accumulate, RL computes </w:t>
+      </w:r>
+      <w:proofErr w:type="spellStart"/>
+      <w:r>
+        <w:t>avg</w:t>
+      </w:r>
+      <w:proofErr w:type="spellEnd"/>
+      <w:r>
+        <w:t xml:space="preserve"> per context, adjusts thresholds (e.g., if high rewards in ICU, lower threshold for more aggression), clears memory.</w:t>
+      </w:r>
+    </w:p>
+    <w:p>
+      <w:pPr>
+        <w:numPr>
+          <w:ilvl w:val="0"/>
+          <w:numId w:val="4"/>
+        </w:numPr>
+      </w:pPr>
+      <w:r>
+        <w:rPr>
+          <w:b/>
+          <w:bCs/>
+        </w:rPr>
+        <w:t>Benefits</w:t>
+      </w:r>
+      <w:r>
+        <w:t>: Personalizes responses (e.g., ICU devices get tailored thresholds), reduces errors over time, maintains global fallbacks.</w:t>
       </w:r>
     </w:p>
     <w:p/>
@@ -421,6 +664,268 @@
     </w:lvl>
   </w:abstractNum>
   <w:abstractNum w:abstractNumId="1" w15:restartNumberingAfterBreak="0">
+    <w:nsid w:val="42A4457C"/>
+    <w:multiLevelType w:val="multilevel"/>
+    <w:tmpl w:val="E704141C"/>
+    <w:lvl w:ilvl="0">
+      <w:start w:val="1"/>
+      <w:numFmt w:val="bullet"/>
+      <w:lvlText w:val=""/>
+      <w:lvlJc w:val="left"/>
+      <w:pPr>
+        <w:tabs>
+          <w:tab w:val="num" w:pos="720"/>
+        </w:tabs>
+        <w:ind w:left="720" w:hanging="360"/>
+      </w:pPr>
+      <w:rPr>
+        <w:rFonts w:ascii="Symbol" w:hAnsi="Symbol" w:hint="default"/>
+        <w:sz w:val="20"/>
+      </w:rPr>
+    </w:lvl>
+    <w:lvl w:ilvl="1" w:tentative="1">
+      <w:start w:val="1"/>
+      <w:numFmt w:val="bullet"/>
+      <w:lvlText w:val=""/>
+      <w:lvlJc w:val="left"/>
+      <w:pPr>
+        <w:tabs>
+          <w:tab w:val="num" w:pos="1440"/>
+        </w:tabs>
+        <w:ind w:left="1440" w:hanging="360"/>
+      </w:pPr>
+      <w:rPr>
+        <w:rFonts w:ascii="Symbol" w:hAnsi="Symbol" w:hint="default"/>
+        <w:sz w:val="20"/>
+      </w:rPr>
+    </w:lvl>
+    <w:lvl w:ilvl="2" w:tentative="1">
+      <w:start w:val="1"/>
+      <w:numFmt w:val="bullet"/>
+      <w:lvlText w:val=""/>
+      <w:lvlJc w:val="left"/>
+      <w:pPr>
+        <w:tabs>
+          <w:tab w:val="num" w:pos="2160"/>
+        </w:tabs>
+        <w:ind w:left="2160" w:hanging="360"/>
+      </w:pPr>
+      <w:rPr>
+        <w:rFonts w:ascii="Symbol" w:hAnsi="Symbol" w:hint="default"/>
+        <w:sz w:val="20"/>
+      </w:rPr>
+    </w:lvl>
+    <w:lvl w:ilvl="3" w:tentative="1">
+      <w:start w:val="1"/>
+      <w:numFmt w:val="bullet"/>
+      <w:lvlText w:val=""/>
+      <w:lvlJc w:val="left"/>
+      <w:pPr>
+        <w:tabs>
+          <w:tab w:val="num" w:pos="2880"/>
+        </w:tabs>
+        <w:ind w:left="2880" w:hanging="360"/>
+      </w:pPr>
+      <w:rPr>
+        <w:rFonts w:ascii="Symbol" w:hAnsi="Symbol" w:hint="default"/>
+        <w:sz w:val="20"/>
+      </w:rPr>
+    </w:lvl>
+    <w:lvl w:ilvl="4" w:tentative="1">
+      <w:start w:val="1"/>
+      <w:numFmt w:val="bullet"/>
+      <w:lvlText w:val=""/>
+      <w:lvlJc w:val="left"/>
+      <w:pPr>
+        <w:tabs>
+          <w:tab w:val="num" w:pos="3600"/>
+        </w:tabs>
+        <w:ind w:left="3600" w:hanging="360"/>
+      </w:pPr>
+      <w:rPr>
+        <w:rFonts w:ascii="Symbol" w:hAnsi="Symbol" w:hint="default"/>
+        <w:sz w:val="20"/>
+      </w:rPr>
+    </w:lvl>
+    <w:lvl w:ilvl="5" w:tentative="1">
+      <w:start w:val="1"/>
+      <w:numFmt w:val="bullet"/>
+      <w:lvlText w:val=""/>
+      <w:lvlJc w:val="left"/>
+      <w:pPr>
+        <w:tabs>
+          <w:tab w:val="num" w:pos="4320"/>
+        </w:tabs>
+        <w:ind w:left="4320" w:hanging="360"/>
+      </w:pPr>
+      <w:rPr>
+        <w:rFonts w:ascii="Symbol" w:hAnsi="Symbol" w:hint="default"/>
+        <w:sz w:val="20"/>
+      </w:rPr>
+    </w:lvl>
+    <w:lvl w:ilvl="6" w:tentative="1">
+      <w:start w:val="1"/>
+      <w:numFmt w:val="bullet"/>
+      <w:lvlText w:val=""/>
+      <w:lvlJc w:val="left"/>
+      <w:pPr>
+        <w:tabs>
+          <w:tab w:val="num" w:pos="5040"/>
+        </w:tabs>
+        <w:ind w:left="5040" w:hanging="360"/>
+      </w:pPr>
+      <w:rPr>
+        <w:rFonts w:ascii="Symbol" w:hAnsi="Symbol" w:hint="default"/>
+        <w:sz w:val="20"/>
+      </w:rPr>
+    </w:lvl>
+    <w:lvl w:ilvl="7" w:tentative="1">
+      <w:start w:val="1"/>
+      <w:numFmt w:val="bullet"/>
+      <w:lvlText w:val=""/>
+      <w:lvlJc w:val="left"/>
+      <w:pPr>
+        <w:tabs>
+          <w:tab w:val="num" w:pos="5760"/>
+        </w:tabs>
+        <w:ind w:left="5760" w:hanging="360"/>
+      </w:pPr>
+      <w:rPr>
+        <w:rFonts w:ascii="Symbol" w:hAnsi="Symbol" w:hint="default"/>
+        <w:sz w:val="20"/>
+      </w:rPr>
+    </w:lvl>
+    <w:lvl w:ilvl="8" w:tentative="1">
+      <w:start w:val="1"/>
+      <w:numFmt w:val="bullet"/>
+      <w:lvlText w:val=""/>
+      <w:lvlJc w:val="left"/>
+      <w:pPr>
+        <w:tabs>
+          <w:tab w:val="num" w:pos="6480"/>
+        </w:tabs>
+        <w:ind w:left="6480" w:hanging="360"/>
+      </w:pPr>
+      <w:rPr>
+        <w:rFonts w:ascii="Symbol" w:hAnsi="Symbol" w:hint="default"/>
+        <w:sz w:val="20"/>
+      </w:rPr>
+    </w:lvl>
+  </w:abstractNum>
+  <w:abstractNum w:abstractNumId="2" w15:restartNumberingAfterBreak="0">
+    <w:nsid w:val="4DC834B4"/>
+    <w:multiLevelType w:val="multilevel"/>
+    <w:tmpl w:val="231660CA"/>
+    <w:lvl w:ilvl="0">
+      <w:start w:val="1"/>
+      <w:numFmt w:val="decimal"/>
+      <w:lvlText w:val="%1."/>
+      <w:lvlJc w:val="left"/>
+      <w:pPr>
+        <w:tabs>
+          <w:tab w:val="num" w:pos="720"/>
+        </w:tabs>
+        <w:ind w:left="720" w:hanging="360"/>
+      </w:pPr>
+    </w:lvl>
+    <w:lvl w:ilvl="1" w:tentative="1">
+      <w:start w:val="1"/>
+      <w:numFmt w:val="decimal"/>
+      <w:lvlText w:val="%2."/>
+      <w:lvlJc w:val="left"/>
+      <w:pPr>
+        <w:tabs>
+          <w:tab w:val="num" w:pos="1440"/>
+        </w:tabs>
+        <w:ind w:left="1440" w:hanging="360"/>
+      </w:pPr>
+    </w:lvl>
+    <w:lvl w:ilvl="2" w:tentative="1">
+      <w:start w:val="1"/>
+      <w:numFmt w:val="decimal"/>
+      <w:lvlText w:val="%3."/>
+      <w:lvlJc w:val="left"/>
+      <w:pPr>
+        <w:tabs>
+          <w:tab w:val="num" w:pos="2160"/>
+        </w:tabs>
+        <w:ind w:left="2160" w:hanging="360"/>
+      </w:pPr>
+    </w:lvl>
+    <w:lvl w:ilvl="3" w:tentative="1">
+      <w:start w:val="1"/>
+      <w:numFmt w:val="decimal"/>
+      <w:lvlText w:val="%4."/>
+      <w:lvlJc w:val="left"/>
+      <w:pPr>
+        <w:tabs>
+          <w:tab w:val="num" w:pos="2880"/>
+        </w:tabs>
+        <w:ind w:left="2880" w:hanging="360"/>
+      </w:pPr>
+    </w:lvl>
+    <w:lvl w:ilvl="4" w:tentative="1">
+      <w:start w:val="1"/>
+      <w:numFmt w:val="decimal"/>
+      <w:lvlText w:val="%5."/>
+      <w:lvlJc w:val="left"/>
+      <w:pPr>
+        <w:tabs>
+          <w:tab w:val="num" w:pos="3600"/>
+        </w:tabs>
+        <w:ind w:left="3600" w:hanging="360"/>
+      </w:pPr>
+    </w:lvl>
+    <w:lvl w:ilvl="5" w:tentative="1">
+      <w:start w:val="1"/>
+      <w:numFmt w:val="decimal"/>
+      <w:lvlText w:val="%6."/>
+      <w:lvlJc w:val="left"/>
+      <w:pPr>
+        <w:tabs>
+          <w:tab w:val="num" w:pos="4320"/>
+        </w:tabs>
+        <w:ind w:left="4320" w:hanging="360"/>
+      </w:pPr>
+    </w:lvl>
+    <w:lvl w:ilvl="6" w:tentative="1">
+      <w:start w:val="1"/>
+      <w:numFmt w:val="decimal"/>
+      <w:lvlText w:val="%7."/>
+      <w:lvlJc w:val="left"/>
+      <w:pPr>
+        <w:tabs>
+          <w:tab w:val="num" w:pos="5040"/>
+        </w:tabs>
+        <w:ind w:left="5040" w:hanging="360"/>
+      </w:pPr>
+    </w:lvl>
+    <w:lvl w:ilvl="7" w:tentative="1">
+      <w:start w:val="1"/>
+      <w:numFmt w:val="decimal"/>
+      <w:lvlText w:val="%8."/>
+      <w:lvlJc w:val="left"/>
+      <w:pPr>
+        <w:tabs>
+          <w:tab w:val="num" w:pos="5760"/>
+        </w:tabs>
+        <w:ind w:left="5760" w:hanging="360"/>
+      </w:pPr>
+    </w:lvl>
+    <w:lvl w:ilvl="8" w:tentative="1">
+      <w:start w:val="1"/>
+      <w:numFmt w:val="decimal"/>
+      <w:lvlText w:val="%9."/>
+      <w:lvlJc w:val="left"/>
+      <w:pPr>
+        <w:tabs>
+          <w:tab w:val="num" w:pos="6480"/>
+        </w:tabs>
+        <w:ind w:left="6480" w:hanging="360"/>
+      </w:pPr>
+    </w:lvl>
+  </w:abstractNum>
+  <w:abstractNum w:abstractNumId="3" w15:restartNumberingAfterBreak="0">
     <w:nsid w:val="6C484DA4"/>
     <w:multiLevelType w:val="multilevel"/>
     <w:tmpl w:val="88326032"/>
@@ -570,10 +1075,16 @@
     </w:lvl>
   </w:abstractNum>
   <w:num w:numId="1" w16cid:durableId="2067951894">
-    <w:abstractNumId w:val="1"/>
+    <w:abstractNumId w:val="3"/>
   </w:num>
   <w:num w:numId="2" w16cid:durableId="541332530">
     <w:abstractNumId w:val="0"/>
+  </w:num>
+  <w:num w:numId="3" w16cid:durableId="1152869297">
+    <w:abstractNumId w:val="2"/>
+  </w:num>
+  <w:num w:numId="4" w16cid:durableId="2090999717">
+    <w:abstractNumId w:val="1"/>
   </w:num>
 </w:numbering>
 </file>

</xml_diff>